<commit_message>
added inital rules and templates
</commit_message>
<xml_diff>
--- a/Clash-Royale-Deck-Chooser.docx
+++ b/Clash-Royale-Deck-Chooser.docx
@@ -150,13 +150,8 @@
       </w:r>
       <w:proofErr w:type="spellEnd"/>
       <w:r>
-        <w:t xml:space="preserve"> </w:t>
-      </w:r>
-      <w:proofErr w:type="spellStart"/>
-      <w:r>
-        <w:t>mečeva</w:t>
-      </w:r>
-      <w:proofErr w:type="spellEnd"/>
+        <w:t xml:space="preserve"> mečeva</w:t>
+      </w:r>
     </w:p>
     <w:p>
       <w:pPr>
@@ -6120,17 +6115,12 @@
         <w:ind w:left="340" w:hanging="227"/>
       </w:pPr>
       <w:proofErr w:type="spellStart"/>
-      <w:proofErr w:type="gramStart"/>
       <w:r>
         <w:t>Igrač</w:t>
       </w:r>
       <w:proofErr w:type="spellEnd"/>
       <w:r>
-        <w:t>(</w:t>
-      </w:r>
-      <w:proofErr w:type="gramEnd"/>
-      <w:r>
-        <w:t xml:space="preserve">id, </w:t>
+        <w:t xml:space="preserve">(id, </w:t>
       </w:r>
       <w:proofErr w:type="spellStart"/>
       <w:r>
@@ -6251,13 +6241,8 @@
         <w:spacing w:after="60"/>
         <w:ind w:left="340" w:hanging="227"/>
       </w:pPr>
-      <w:proofErr w:type="gramStart"/>
-      <w:r>
-        <w:t>Karta(</w:t>
-      </w:r>
-      <w:proofErr w:type="gramEnd"/>
-      <w:r>
-        <w:t xml:space="preserve">id, </w:t>
+      <w:r>
+        <w:t xml:space="preserve">Karta(id, </w:t>
       </w:r>
       <w:proofErr w:type="spellStart"/>
       <w:r>
@@ -6318,12 +6303,10 @@
       <w:r>
         <w:t xml:space="preserve"> </w:t>
       </w:r>
-      <w:proofErr w:type="gramStart"/>
       <w:r>
         <w:t>Karte(</w:t>
       </w:r>
       <w:proofErr w:type="spellStart"/>
-      <w:proofErr w:type="gramEnd"/>
       <w:r>
         <w:t>igrač</w:t>
       </w:r>
@@ -6363,17 +6346,12 @@
         <w:ind w:left="340" w:hanging="227"/>
       </w:pPr>
       <w:proofErr w:type="spellStart"/>
-      <w:proofErr w:type="gramStart"/>
       <w:r>
         <w:t>Meč</w:t>
       </w:r>
       <w:proofErr w:type="spellEnd"/>
       <w:r>
-        <w:t>(</w:t>
-      </w:r>
-      <w:proofErr w:type="gramEnd"/>
-      <w:r>
-        <w:t xml:space="preserve">id, </w:t>
+        <w:t xml:space="preserve">(id, </w:t>
       </w:r>
       <w:proofErr w:type="spellStart"/>
       <w:r>
@@ -6463,12 +6441,10 @@
       <w:r>
         <w:t xml:space="preserve"> </w:t>
       </w:r>
-      <w:proofErr w:type="gramStart"/>
       <w:r>
         <w:t>Meča(</w:t>
       </w:r>
       <w:proofErr w:type="spellStart"/>
-      <w:proofErr w:type="gramEnd"/>
       <w:r>
         <w:t>vreme</w:t>
       </w:r>
@@ -6507,12 +6483,10 @@
       <w:r>
         <w:t xml:space="preserve"> </w:t>
       </w:r>
-      <w:proofErr w:type="gramStart"/>
       <w:r>
         <w:t>Špil(</w:t>
       </w:r>
       <w:proofErr w:type="spellStart"/>
-      <w:proofErr w:type="gramEnd"/>
       <w:r>
         <w:t>igrač</w:t>
       </w:r>
@@ -11191,6 +11165,11 @@
       </w:r>
     </w:p>
     <w:p>
+      <w:pPr>
+        <w:rPr>
+          <w:lang w:val="sr-Latn-RS"/>
+        </w:rPr>
+      </w:pPr>
       <w:r>
         <w:t xml:space="preserve">Ovo je </w:t>
       </w:r>
@@ -11248,307 +11227,142 @@
       </w:r>
       <w:proofErr w:type="spellEnd"/>
       <w:r>
+        <w:t>.</w:t>
+      </w:r>
+      <w:r>
+        <w:t xml:space="preserve"> </w:t>
+      </w:r>
+      <w:proofErr w:type="spellStart"/>
+      <w:r>
+        <w:t>Generisaće</w:t>
+      </w:r>
+      <w:proofErr w:type="spellEnd"/>
+      <w:r>
+        <w:t xml:space="preserve"> se </w:t>
+      </w:r>
+      <w:proofErr w:type="spellStart"/>
+      <w:r>
+        <w:t>pravila</w:t>
+      </w:r>
+      <w:proofErr w:type="spellEnd"/>
+      <w:r>
+        <w:t xml:space="preserve"> da li je tip deka </w:t>
+      </w:r>
+      <w:proofErr w:type="spellStart"/>
+      <w:r>
+        <w:t>validan</w:t>
+      </w:r>
+      <w:proofErr w:type="spellEnd"/>
+      <w:r>
+        <w:t xml:space="preserve"> </w:t>
+      </w:r>
+      <w:proofErr w:type="spellStart"/>
+      <w:r>
+        <w:t>na</w:t>
+      </w:r>
+      <w:proofErr w:type="spellEnd"/>
+      <w:r>
+        <w:t xml:space="preserve"> </w:t>
+      </w:r>
+      <w:proofErr w:type="spellStart"/>
+      <w:r>
+        <w:t>osnovu</w:t>
+      </w:r>
+      <w:proofErr w:type="spellEnd"/>
+      <w:r>
+        <w:t xml:space="preserve"> </w:t>
+      </w:r>
+      <w:proofErr w:type="spellStart"/>
+      <w:r>
+        <w:t>parametra</w:t>
+      </w:r>
+      <w:proofErr w:type="spellEnd"/>
+      <w:r>
+        <w:t xml:space="preserve"> o tom </w:t>
+      </w:r>
+      <w:proofErr w:type="spellStart"/>
+      <w:r>
+        <w:t>tipu</w:t>
+      </w:r>
+      <w:proofErr w:type="spellEnd"/>
+      <w:r>
         <w:t xml:space="preserve">. Na primer, </w:t>
       </w:r>
       <w:proofErr w:type="spellStart"/>
       <w:r>
-        <w:t>različiti</w:t>
-      </w:r>
-      <w:proofErr w:type="spellEnd"/>
-      <w:r>
-        <w:t xml:space="preserve"> </w:t>
-      </w:r>
-      <w:proofErr w:type="spellStart"/>
-      <w:r>
-        <w:t>arhetipovi</w:t>
-      </w:r>
-      <w:proofErr w:type="spellEnd"/>
-      <w:r>
-        <w:t xml:space="preserve"> </w:t>
-      </w:r>
-      <w:proofErr w:type="spellStart"/>
-      <w:r>
-        <w:t>špilova</w:t>
-      </w:r>
-      <w:proofErr w:type="spellEnd"/>
-      <w:r>
-        <w:t xml:space="preserve"> </w:t>
-      </w:r>
-      <w:proofErr w:type="spellStart"/>
-      <w:r>
-        <w:t>mogu</w:t>
-      </w:r>
-      <w:proofErr w:type="spellEnd"/>
-      <w:r>
-        <w:t xml:space="preserve"> </w:t>
-      </w:r>
-      <w:proofErr w:type="spellStart"/>
-      <w:r>
-        <w:t>imati</w:t>
-      </w:r>
-      <w:proofErr w:type="spellEnd"/>
-      <w:r>
-        <w:t xml:space="preserve"> </w:t>
-      </w:r>
-      <w:proofErr w:type="spellStart"/>
-      <w:r>
-        <w:t>sličnu</w:t>
-      </w:r>
-      <w:proofErr w:type="spellEnd"/>
-      <w:r>
-        <w:t xml:space="preserve"> </w:t>
-      </w:r>
-      <w:proofErr w:type="spellStart"/>
-      <w:r>
-        <w:t>logiku</w:t>
-      </w:r>
-      <w:proofErr w:type="spellEnd"/>
-      <w:r>
-        <w:t xml:space="preserve">: </w:t>
-      </w:r>
-      <w:proofErr w:type="spellStart"/>
-      <w:r>
-        <w:t>svaki</w:t>
-      </w:r>
-      <w:proofErr w:type="spellEnd"/>
-      <w:r>
-        <w:t xml:space="preserve"> </w:t>
-      </w:r>
-      <w:proofErr w:type="spellStart"/>
-      <w:r>
-        <w:t>arhetip</w:t>
-      </w:r>
-      <w:proofErr w:type="spellEnd"/>
-      <w:r>
-        <w:t xml:space="preserve"> </w:t>
-      </w:r>
-      <w:proofErr w:type="spellStart"/>
-      <w:r>
-        <w:t>zahteva</w:t>
-      </w:r>
-      <w:proofErr w:type="spellEnd"/>
-      <w:r>
-        <w:t xml:space="preserve"> </w:t>
-      </w:r>
-      <w:proofErr w:type="spellStart"/>
-      <w:r>
-        <w:t>određene</w:t>
-      </w:r>
-      <w:proofErr w:type="spellEnd"/>
-      <w:r>
-        <w:t xml:space="preserve"> </w:t>
-      </w:r>
-      <w:proofErr w:type="spellStart"/>
-      <w:r>
-        <w:t>uloge</w:t>
-      </w:r>
-      <w:proofErr w:type="spellEnd"/>
-      <w:r>
-        <w:t xml:space="preserve"> </w:t>
-      </w:r>
-      <w:proofErr w:type="spellStart"/>
-      <w:r>
-        <w:t>karata</w:t>
-      </w:r>
-      <w:proofErr w:type="spellEnd"/>
-      <w:r>
-        <w:t xml:space="preserve">, </w:t>
-      </w:r>
-      <w:proofErr w:type="spellStart"/>
-      <w:r>
-        <w:t>određeni</w:t>
-      </w:r>
-      <w:proofErr w:type="spellEnd"/>
-      <w:r>
-        <w:t xml:space="preserve"> </w:t>
-      </w:r>
-      <w:proofErr w:type="spellStart"/>
-      <w:r>
-        <w:t>raspon</w:t>
-      </w:r>
-      <w:proofErr w:type="spellEnd"/>
-      <w:r>
-        <w:t xml:space="preserve"> </w:t>
-      </w:r>
-      <w:proofErr w:type="spellStart"/>
-      <w:r>
-        <w:t>prosečnog</w:t>
-      </w:r>
-      <w:proofErr w:type="spellEnd"/>
-      <w:r>
-        <w:t xml:space="preserve"> </w:t>
-      </w:r>
-      <w:proofErr w:type="spellStart"/>
-      <w:r>
-        <w:t>eliksira</w:t>
-      </w:r>
-      <w:proofErr w:type="spellEnd"/>
-      <w:r>
-        <w:t xml:space="preserve">, </w:t>
-      </w:r>
-      <w:proofErr w:type="spellStart"/>
-      <w:r>
-        <w:t>minimalan</w:t>
-      </w:r>
-      <w:proofErr w:type="spellEnd"/>
-      <w:r>
-        <w:t xml:space="preserve"> </w:t>
-      </w:r>
-      <w:proofErr w:type="spellStart"/>
-      <w:r>
-        <w:t>broj</w:t>
-      </w:r>
-      <w:proofErr w:type="spellEnd"/>
-      <w:r>
-        <w:t xml:space="preserve"> spell </w:t>
-      </w:r>
-      <w:proofErr w:type="spellStart"/>
-      <w:r>
-        <w:t>ili</w:t>
-      </w:r>
-      <w:proofErr w:type="spellEnd"/>
-      <w:r>
-        <w:t xml:space="preserve"> anti-air </w:t>
-      </w:r>
-      <w:proofErr w:type="spellStart"/>
-      <w:r>
-        <w:t>karata</w:t>
-      </w:r>
-      <w:proofErr w:type="spellEnd"/>
-      <w:r>
-        <w:t xml:space="preserve"> </w:t>
-      </w:r>
-      <w:proofErr w:type="spellStart"/>
-      <w:r>
-        <w:t>i</w:t>
-      </w:r>
-      <w:proofErr w:type="spellEnd"/>
-      <w:r>
-        <w:t xml:space="preserve"> </w:t>
-      </w:r>
-      <w:proofErr w:type="spellStart"/>
-      <w:r>
-        <w:t>druga</w:t>
-      </w:r>
-      <w:proofErr w:type="spellEnd"/>
-      <w:r>
-        <w:t xml:space="preserve"> </w:t>
-      </w:r>
-      <w:proofErr w:type="spellStart"/>
-      <w:r>
-        <w:t>ograničenja</w:t>
-      </w:r>
-      <w:proofErr w:type="spellEnd"/>
-      <w:r>
-        <w:t xml:space="preserve">. </w:t>
-      </w:r>
-      <w:proofErr w:type="spellStart"/>
-      <w:r>
-        <w:t>Umesto</w:t>
-      </w:r>
-      <w:proofErr w:type="spellEnd"/>
-      <w:r>
-        <w:t xml:space="preserve"> da se za </w:t>
-      </w:r>
-      <w:proofErr w:type="spellStart"/>
-      <w:r>
-        <w:t>svaki</w:t>
-      </w:r>
-      <w:proofErr w:type="spellEnd"/>
-      <w:r>
-        <w:t xml:space="preserve"> </w:t>
-      </w:r>
-      <w:proofErr w:type="spellStart"/>
-      <w:r>
-        <w:t>arhetip</w:t>
-      </w:r>
-      <w:proofErr w:type="spellEnd"/>
-      <w:r>
-        <w:t xml:space="preserve"> </w:t>
-      </w:r>
-      <w:proofErr w:type="spellStart"/>
-      <w:r>
-        <w:t>posebno</w:t>
-      </w:r>
-      <w:proofErr w:type="spellEnd"/>
-      <w:r>
-        <w:t xml:space="preserve"> </w:t>
-      </w:r>
-      <w:proofErr w:type="spellStart"/>
-      <w:r>
-        <w:t>piše</w:t>
-      </w:r>
-      <w:proofErr w:type="spellEnd"/>
-      <w:r>
-        <w:t xml:space="preserve"> </w:t>
-      </w:r>
-      <w:proofErr w:type="spellStart"/>
-      <w:r>
-        <w:t>skoro</w:t>
-      </w:r>
-      <w:proofErr w:type="spellEnd"/>
-      <w:r>
-        <w:t xml:space="preserve"> </w:t>
-      </w:r>
-      <w:proofErr w:type="spellStart"/>
-      <w:r>
-        <w:t>isto</w:t>
-      </w:r>
-      <w:proofErr w:type="spellEnd"/>
-      <w:r>
-        <w:t xml:space="preserve"> </w:t>
-      </w:r>
-      <w:proofErr w:type="spellStart"/>
-      <w:r>
-        <w:t>pravilo</w:t>
-      </w:r>
-      <w:proofErr w:type="spellEnd"/>
-      <w:r>
-        <w:t xml:space="preserve">, </w:t>
-      </w:r>
-      <w:proofErr w:type="spellStart"/>
-      <w:r>
-        <w:t>sistem</w:t>
-      </w:r>
-      <w:proofErr w:type="spellEnd"/>
-      <w:r>
-        <w:t xml:space="preserve"> </w:t>
-      </w:r>
-      <w:proofErr w:type="spellStart"/>
-      <w:r>
-        <w:t>može</w:t>
-      </w:r>
-      <w:proofErr w:type="spellEnd"/>
-      <w:r>
-        <w:t xml:space="preserve"> da </w:t>
-      </w:r>
-      <w:proofErr w:type="spellStart"/>
-      <w:r>
-        <w:t>koristi</w:t>
-      </w:r>
-      <w:proofErr w:type="spellEnd"/>
-      <w:r>
-        <w:t xml:space="preserve"> </w:t>
-      </w:r>
-      <w:proofErr w:type="spellStart"/>
-      <w:r>
-        <w:t>jedan</w:t>
-      </w:r>
-      <w:proofErr w:type="spellEnd"/>
-      <w:r>
-        <w:t xml:space="preserve"> </w:t>
-      </w:r>
-      <w:proofErr w:type="spellStart"/>
-      <w:r>
-        <w:t>šablon</w:t>
-      </w:r>
-      <w:proofErr w:type="spellEnd"/>
-      <w:r>
-        <w:t xml:space="preserve"> </w:t>
-      </w:r>
-      <w:proofErr w:type="spellStart"/>
-      <w:r>
-        <w:t>i</w:t>
+        <w:t>pravila</w:t>
+      </w:r>
+      <w:proofErr w:type="spellEnd"/>
+      <w:r>
+        <w:t xml:space="preserve">: da li je cycle deck </w:t>
+      </w:r>
+      <w:proofErr w:type="spellStart"/>
+      <w:r>
+        <w:t>validan</w:t>
+      </w:r>
+      <w:proofErr w:type="spellEnd"/>
+      <w:r>
+        <w:t xml:space="preserve">, da li je beatdown deck </w:t>
+      </w:r>
+      <w:proofErr w:type="spellStart"/>
+      <w:r>
+        <w:t>validan</w:t>
+      </w:r>
+      <w:proofErr w:type="spellEnd"/>
+      <w:r>
+        <w:t xml:space="preserve"> </w:t>
+      </w:r>
+      <w:proofErr w:type="spellStart"/>
+      <w:r>
+        <w:t>neće</w:t>
+      </w:r>
+      <w:proofErr w:type="spellEnd"/>
+      <w:r>
+        <w:t xml:space="preserve"> </w:t>
+      </w:r>
+      <w:proofErr w:type="spellStart"/>
+      <w:r>
+        <w:t>biti</w:t>
+      </w:r>
+      <w:proofErr w:type="spellEnd"/>
+      <w:r>
+        <w:t xml:space="preserve"> </w:t>
+      </w:r>
+      <w:proofErr w:type="spellStart"/>
+      <w:r>
+        <w:t>ručno</w:t>
+      </w:r>
+      <w:proofErr w:type="spellEnd"/>
+      <w:r>
+        <w:t xml:space="preserve"> </w:t>
+      </w:r>
+      <w:proofErr w:type="spellStart"/>
+      <w:r>
+        <w:t>iskucana</w:t>
+      </w:r>
+      <w:proofErr w:type="spellEnd"/>
+      <w:r>
+        <w:t xml:space="preserve"> </w:t>
+      </w:r>
+      <w:proofErr w:type="spellStart"/>
+      <w:r>
+        <w:t>već</w:t>
+      </w:r>
+      <w:proofErr w:type="spellEnd"/>
+      <w:r>
+        <w:t xml:space="preserve"> </w:t>
+      </w:r>
+      <w:proofErr w:type="spellStart"/>
+      <w:r>
+        <w:t>će</w:t>
+      </w:r>
+      <w:proofErr w:type="spellEnd"/>
+      <w:r>
+        <w:t xml:space="preserve"> se </w:t>
+      </w:r>
+      <w:proofErr w:type="spellStart"/>
+      <w:r>
+        <w:t>generisati</w:t>
       </w:r>
       <w:proofErr w:type="spellEnd"/>
       <w:r>
@@ -11560,833 +11374,7 @@
       </w:r>
       <w:proofErr w:type="spellEnd"/>
       <w:r>
-        <w:t xml:space="preserve"> </w:t>
-      </w:r>
-      <w:proofErr w:type="spellStart"/>
-      <w:r>
-        <w:t>njega</w:t>
-      </w:r>
-      <w:proofErr w:type="spellEnd"/>
-      <w:r>
-        <w:t xml:space="preserve"> </w:t>
-      </w:r>
-      <w:proofErr w:type="spellStart"/>
-      <w:r>
-        <w:t>automatski</w:t>
-      </w:r>
-      <w:proofErr w:type="spellEnd"/>
-      <w:r>
-        <w:t xml:space="preserve"> </w:t>
-      </w:r>
-      <w:proofErr w:type="spellStart"/>
-      <w:r>
-        <w:t>napravi</w:t>
-      </w:r>
-      <w:proofErr w:type="spellEnd"/>
-      <w:r>
-        <w:t xml:space="preserve"> </w:t>
-      </w:r>
-      <w:proofErr w:type="spellStart"/>
-      <w:r>
-        <w:t>više</w:t>
-      </w:r>
-      <w:proofErr w:type="spellEnd"/>
-      <w:r>
-        <w:t xml:space="preserve"> </w:t>
-      </w:r>
-      <w:proofErr w:type="spellStart"/>
-      <w:r>
-        <w:t>konkretnih</w:t>
-      </w:r>
-      <w:proofErr w:type="spellEnd"/>
-      <w:r>
-        <w:t xml:space="preserve"> </w:t>
-      </w:r>
-      <w:proofErr w:type="spellStart"/>
-      <w:r>
-        <w:t>pravila</w:t>
-      </w:r>
-      <w:proofErr w:type="spellEnd"/>
-      <w:r>
-        <w:t>.</w:t>
-      </w:r>
-    </w:p>
-    <w:p>
-      <w:r>
-        <w:t xml:space="preserve">Na primer, za cycle </w:t>
-      </w:r>
-      <w:proofErr w:type="spellStart"/>
-      <w:r>
-        <w:t>arhetip</w:t>
-      </w:r>
-      <w:proofErr w:type="spellEnd"/>
-      <w:r>
-        <w:t xml:space="preserve"> </w:t>
-      </w:r>
-      <w:proofErr w:type="spellStart"/>
-      <w:r>
-        <w:t>može</w:t>
-      </w:r>
-      <w:proofErr w:type="spellEnd"/>
-      <w:r>
-        <w:t xml:space="preserve"> se </w:t>
-      </w:r>
-      <w:proofErr w:type="spellStart"/>
-      <w:r>
-        <w:t>definisati</w:t>
-      </w:r>
-      <w:proofErr w:type="spellEnd"/>
-      <w:r>
-        <w:t xml:space="preserve"> da </w:t>
-      </w:r>
-      <w:proofErr w:type="spellStart"/>
-      <w:r>
-        <w:t>špil</w:t>
-      </w:r>
-      <w:proofErr w:type="spellEnd"/>
-      <w:r>
-        <w:t xml:space="preserve"> </w:t>
-      </w:r>
-      <w:proofErr w:type="spellStart"/>
-      <w:r>
-        <w:t>treba</w:t>
-      </w:r>
-      <w:proofErr w:type="spellEnd"/>
-      <w:r>
-        <w:t xml:space="preserve"> da </w:t>
-      </w:r>
-      <w:proofErr w:type="spellStart"/>
-      <w:r>
-        <w:t>ima</w:t>
-      </w:r>
-      <w:proofErr w:type="spellEnd"/>
-      <w:r>
-        <w:t xml:space="preserve"> </w:t>
-      </w:r>
-      <w:proofErr w:type="spellStart"/>
-      <w:r>
-        <w:t>jeftinu</w:t>
-      </w:r>
-      <w:proofErr w:type="spellEnd"/>
-      <w:r>
-        <w:t xml:space="preserve"> win condition </w:t>
-      </w:r>
-      <w:proofErr w:type="spellStart"/>
-      <w:r>
-        <w:t>kartu</w:t>
-      </w:r>
-      <w:proofErr w:type="spellEnd"/>
-      <w:r>
-        <w:t xml:space="preserve">, </w:t>
-      </w:r>
-      <w:proofErr w:type="spellStart"/>
-      <w:r>
-        <w:t>nisku</w:t>
-      </w:r>
-      <w:proofErr w:type="spellEnd"/>
-      <w:r>
-        <w:t xml:space="preserve"> </w:t>
-      </w:r>
-      <w:proofErr w:type="spellStart"/>
-      <w:r>
-        <w:t>prosečnu</w:t>
-      </w:r>
-      <w:proofErr w:type="spellEnd"/>
-      <w:r>
-        <w:t xml:space="preserve"> </w:t>
-      </w:r>
-      <w:proofErr w:type="spellStart"/>
-      <w:r>
-        <w:t>cenu</w:t>
-      </w:r>
-      <w:proofErr w:type="spellEnd"/>
-      <w:r>
-        <w:t xml:space="preserve"> </w:t>
-      </w:r>
-      <w:proofErr w:type="spellStart"/>
-      <w:r>
-        <w:t>eliksira</w:t>
-      </w:r>
-      <w:proofErr w:type="spellEnd"/>
-      <w:r>
-        <w:t xml:space="preserve"> </w:t>
-      </w:r>
-      <w:proofErr w:type="spellStart"/>
-      <w:r>
-        <w:t>i</w:t>
-      </w:r>
-      <w:proofErr w:type="spellEnd"/>
-      <w:r>
-        <w:t xml:space="preserve"> </w:t>
-      </w:r>
-      <w:proofErr w:type="spellStart"/>
-      <w:r>
-        <w:t>više</w:t>
-      </w:r>
-      <w:proofErr w:type="spellEnd"/>
-      <w:r>
-        <w:t xml:space="preserve"> cycle </w:t>
-      </w:r>
-      <w:proofErr w:type="spellStart"/>
-      <w:r>
-        <w:t>karata</w:t>
-      </w:r>
-      <w:proofErr w:type="spellEnd"/>
-      <w:r>
-        <w:t xml:space="preserve">. Za beatdown </w:t>
-      </w:r>
-      <w:proofErr w:type="spellStart"/>
-      <w:r>
-        <w:t>arhetip</w:t>
-      </w:r>
-      <w:proofErr w:type="spellEnd"/>
-      <w:r>
-        <w:t xml:space="preserve"> </w:t>
-      </w:r>
-      <w:proofErr w:type="spellStart"/>
-      <w:r>
-        <w:t>može</w:t>
-      </w:r>
-      <w:proofErr w:type="spellEnd"/>
-      <w:r>
-        <w:t xml:space="preserve"> se </w:t>
-      </w:r>
-      <w:proofErr w:type="spellStart"/>
-      <w:r>
-        <w:t>definisati</w:t>
-      </w:r>
-      <w:proofErr w:type="spellEnd"/>
-      <w:r>
-        <w:t xml:space="preserve"> da </w:t>
-      </w:r>
-      <w:proofErr w:type="spellStart"/>
-      <w:r>
-        <w:t>špil</w:t>
-      </w:r>
-      <w:proofErr w:type="spellEnd"/>
-      <w:r>
-        <w:t xml:space="preserve"> </w:t>
-      </w:r>
-      <w:proofErr w:type="spellStart"/>
-      <w:r>
-        <w:t>treba</w:t>
-      </w:r>
-      <w:proofErr w:type="spellEnd"/>
-      <w:r>
-        <w:t xml:space="preserve"> da </w:t>
-      </w:r>
-      <w:proofErr w:type="spellStart"/>
-      <w:r>
-        <w:t>ima</w:t>
-      </w:r>
-      <w:proofErr w:type="spellEnd"/>
-      <w:r>
-        <w:t xml:space="preserve"> </w:t>
-      </w:r>
-      <w:proofErr w:type="spellStart"/>
-      <w:r>
-        <w:t>jednu</w:t>
-      </w:r>
-      <w:proofErr w:type="spellEnd"/>
-      <w:r>
-        <w:t xml:space="preserve"> </w:t>
-      </w:r>
-      <w:proofErr w:type="spellStart"/>
-      <w:r>
-        <w:t>jaku</w:t>
-      </w:r>
-      <w:proofErr w:type="spellEnd"/>
-      <w:r>
-        <w:t xml:space="preserve"> tank </w:t>
-      </w:r>
-      <w:proofErr w:type="spellStart"/>
-      <w:r>
-        <w:t>kartu</w:t>
-      </w:r>
-      <w:proofErr w:type="spellEnd"/>
-      <w:r>
-        <w:t xml:space="preserve">, </w:t>
-      </w:r>
-      <w:proofErr w:type="spellStart"/>
-      <w:r>
-        <w:t>podršku</w:t>
-      </w:r>
-      <w:proofErr w:type="spellEnd"/>
-      <w:r>
-        <w:t xml:space="preserve"> </w:t>
-      </w:r>
-      <w:proofErr w:type="spellStart"/>
-      <w:r>
-        <w:t>iza</w:t>
-      </w:r>
-      <w:proofErr w:type="spellEnd"/>
-      <w:r>
-        <w:t xml:space="preserve"> </w:t>
-      </w:r>
-      <w:proofErr w:type="spellStart"/>
-      <w:r>
-        <w:t>tenka</w:t>
-      </w:r>
-      <w:proofErr w:type="spellEnd"/>
-      <w:r>
-        <w:t xml:space="preserve"> </w:t>
-      </w:r>
-      <w:proofErr w:type="spellStart"/>
-      <w:r>
-        <w:t>i</w:t>
-      </w:r>
-      <w:proofErr w:type="spellEnd"/>
-      <w:r>
-        <w:t xml:space="preserve"> </w:t>
-      </w:r>
-      <w:proofErr w:type="spellStart"/>
-      <w:r>
-        <w:t>nešto</w:t>
-      </w:r>
-      <w:proofErr w:type="spellEnd"/>
-      <w:r>
-        <w:t xml:space="preserve"> </w:t>
-      </w:r>
-      <w:proofErr w:type="spellStart"/>
-      <w:r>
-        <w:t>višu</w:t>
-      </w:r>
-      <w:proofErr w:type="spellEnd"/>
-      <w:r>
-        <w:t xml:space="preserve"> </w:t>
-      </w:r>
-      <w:proofErr w:type="spellStart"/>
-      <w:r>
-        <w:t>prosečnu</w:t>
-      </w:r>
-      <w:proofErr w:type="spellEnd"/>
-      <w:r>
-        <w:t xml:space="preserve"> </w:t>
-      </w:r>
-      <w:proofErr w:type="spellStart"/>
-      <w:r>
-        <w:t>cenu</w:t>
-      </w:r>
-      <w:proofErr w:type="spellEnd"/>
-      <w:r>
-        <w:t xml:space="preserve"> </w:t>
-      </w:r>
-      <w:proofErr w:type="spellStart"/>
-      <w:r>
-        <w:t>eliksira</w:t>
-      </w:r>
-      <w:proofErr w:type="spellEnd"/>
-      <w:r>
-        <w:t xml:space="preserve">. Za bait </w:t>
-      </w:r>
-      <w:proofErr w:type="spellStart"/>
-      <w:r>
-        <w:t>arhetip</w:t>
-      </w:r>
-      <w:proofErr w:type="spellEnd"/>
-      <w:r>
-        <w:t xml:space="preserve"> </w:t>
-      </w:r>
-      <w:proofErr w:type="spellStart"/>
-      <w:r>
-        <w:t>može</w:t>
-      </w:r>
-      <w:proofErr w:type="spellEnd"/>
-      <w:r>
-        <w:t xml:space="preserve"> se </w:t>
-      </w:r>
-      <w:proofErr w:type="spellStart"/>
-      <w:r>
-        <w:t>definisati</w:t>
-      </w:r>
-      <w:proofErr w:type="spellEnd"/>
-      <w:r>
-        <w:t xml:space="preserve"> da </w:t>
-      </w:r>
-      <w:proofErr w:type="spellStart"/>
-      <w:r>
-        <w:t>špil</w:t>
-      </w:r>
-      <w:proofErr w:type="spellEnd"/>
-      <w:r>
-        <w:t xml:space="preserve"> </w:t>
-      </w:r>
-      <w:proofErr w:type="spellStart"/>
-      <w:r>
-        <w:t>treba</w:t>
-      </w:r>
-      <w:proofErr w:type="spellEnd"/>
-      <w:r>
-        <w:t xml:space="preserve"> da </w:t>
-      </w:r>
-      <w:proofErr w:type="spellStart"/>
-      <w:r>
-        <w:t>ima</w:t>
-      </w:r>
-      <w:proofErr w:type="spellEnd"/>
-      <w:r>
-        <w:t xml:space="preserve"> </w:t>
-      </w:r>
-      <w:proofErr w:type="spellStart"/>
-      <w:r>
-        <w:t>više</w:t>
-      </w:r>
-      <w:proofErr w:type="spellEnd"/>
-      <w:r>
-        <w:t xml:space="preserve"> </w:t>
-      </w:r>
-      <w:proofErr w:type="spellStart"/>
-      <w:r>
-        <w:t>karata</w:t>
-      </w:r>
-      <w:proofErr w:type="spellEnd"/>
-      <w:r>
-        <w:t xml:space="preserve"> </w:t>
-      </w:r>
-      <w:proofErr w:type="spellStart"/>
-      <w:r>
-        <w:t>koje</w:t>
-      </w:r>
-      <w:proofErr w:type="spellEnd"/>
-      <w:r>
-        <w:t xml:space="preserve"> </w:t>
-      </w:r>
-      <w:proofErr w:type="spellStart"/>
-      <w:r>
-        <w:t>teraju</w:t>
-      </w:r>
-      <w:proofErr w:type="spellEnd"/>
-      <w:r>
-        <w:t xml:space="preserve"> </w:t>
-      </w:r>
-      <w:proofErr w:type="spellStart"/>
-      <w:r>
-        <w:t>protivnika</w:t>
-      </w:r>
-      <w:proofErr w:type="spellEnd"/>
-      <w:r>
-        <w:t xml:space="preserve"> da </w:t>
-      </w:r>
-      <w:proofErr w:type="spellStart"/>
-      <w:r>
-        <w:t>troši</w:t>
-      </w:r>
-      <w:proofErr w:type="spellEnd"/>
-      <w:r>
-        <w:t xml:space="preserve"> </w:t>
-      </w:r>
-      <w:proofErr w:type="spellStart"/>
-      <w:r>
-        <w:t>iste</w:t>
-      </w:r>
-      <w:proofErr w:type="spellEnd"/>
-      <w:r>
-        <w:t xml:space="preserve"> </w:t>
-      </w:r>
-      <w:proofErr w:type="spellStart"/>
-      <w:r>
-        <w:t>odgovore</w:t>
-      </w:r>
-      <w:proofErr w:type="spellEnd"/>
-      <w:r>
-        <w:t xml:space="preserve">. </w:t>
-      </w:r>
-      <w:proofErr w:type="spellStart"/>
-      <w:r>
-        <w:t>Sva</w:t>
-      </w:r>
-      <w:proofErr w:type="spellEnd"/>
-      <w:r>
-        <w:t xml:space="preserve"> ova </w:t>
-      </w:r>
-      <w:proofErr w:type="spellStart"/>
-      <w:r>
-        <w:t>pravila</w:t>
-      </w:r>
-      <w:proofErr w:type="spellEnd"/>
-      <w:r>
-        <w:t xml:space="preserve"> </w:t>
-      </w:r>
-      <w:proofErr w:type="spellStart"/>
-      <w:r>
-        <w:t>imaju</w:t>
-      </w:r>
-      <w:proofErr w:type="spellEnd"/>
-      <w:r>
-        <w:t xml:space="preserve"> </w:t>
-      </w:r>
-      <w:proofErr w:type="spellStart"/>
-      <w:r>
-        <w:t>sličnu</w:t>
-      </w:r>
-      <w:proofErr w:type="spellEnd"/>
-      <w:r>
-        <w:t xml:space="preserve"> </w:t>
-      </w:r>
-      <w:proofErr w:type="spellStart"/>
-      <w:r>
-        <w:t>osnovnu</w:t>
-      </w:r>
-      <w:proofErr w:type="spellEnd"/>
-      <w:r>
-        <w:t xml:space="preserve"> </w:t>
-      </w:r>
-      <w:proofErr w:type="spellStart"/>
-      <w:r>
-        <w:t>strukturu</w:t>
-      </w:r>
-      <w:proofErr w:type="spellEnd"/>
-      <w:r>
-        <w:t xml:space="preserve">, </w:t>
-      </w:r>
-      <w:proofErr w:type="spellStart"/>
-      <w:r>
-        <w:t>ali</w:t>
-      </w:r>
-      <w:proofErr w:type="spellEnd"/>
-      <w:r>
-        <w:t xml:space="preserve"> se </w:t>
-      </w:r>
-      <w:proofErr w:type="spellStart"/>
-      <w:r>
-        <w:t>razlikuju</w:t>
-      </w:r>
-      <w:proofErr w:type="spellEnd"/>
-      <w:r>
-        <w:t xml:space="preserve"> po </w:t>
-      </w:r>
-      <w:proofErr w:type="spellStart"/>
-      <w:r>
-        <w:t>konkretnim</w:t>
-      </w:r>
-      <w:proofErr w:type="spellEnd"/>
-      <w:r>
-        <w:t xml:space="preserve"> </w:t>
-      </w:r>
-      <w:proofErr w:type="spellStart"/>
-      <w:r>
-        <w:t>vrednostima</w:t>
-      </w:r>
-      <w:proofErr w:type="spellEnd"/>
-      <w:r>
-        <w:t xml:space="preserve"> </w:t>
-      </w:r>
-      <w:proofErr w:type="spellStart"/>
-      <w:r>
-        <w:t>i</w:t>
-      </w:r>
-      <w:proofErr w:type="spellEnd"/>
-      <w:r>
-        <w:t xml:space="preserve"> </w:t>
-      </w:r>
-      <w:proofErr w:type="spellStart"/>
-      <w:r>
-        <w:t>uslovima</w:t>
-      </w:r>
-      <w:proofErr w:type="spellEnd"/>
-      <w:r>
-        <w:t xml:space="preserve">, </w:t>
-      </w:r>
-      <w:proofErr w:type="spellStart"/>
-      <w:r>
-        <w:t>zbog</w:t>
-      </w:r>
-      <w:proofErr w:type="spellEnd"/>
-      <w:r>
-        <w:t xml:space="preserve"> </w:t>
-      </w:r>
-      <w:proofErr w:type="spellStart"/>
-      <w:r>
-        <w:t>čega</w:t>
-      </w:r>
-      <w:proofErr w:type="spellEnd"/>
-      <w:r>
-        <w:t xml:space="preserve"> </w:t>
-      </w:r>
-      <w:proofErr w:type="spellStart"/>
-      <w:r>
-        <w:t>su</w:t>
-      </w:r>
-      <w:proofErr w:type="spellEnd"/>
-      <w:r>
-        <w:t xml:space="preserve"> </w:t>
-      </w:r>
-      <w:proofErr w:type="spellStart"/>
-      <w:r>
-        <w:t>pogodna</w:t>
-      </w:r>
-      <w:proofErr w:type="spellEnd"/>
-      <w:r>
-        <w:t xml:space="preserve"> za template </w:t>
-      </w:r>
-      <w:proofErr w:type="spellStart"/>
-      <w:r>
-        <w:t>pristup</w:t>
-      </w:r>
-      <w:proofErr w:type="spellEnd"/>
-      <w:r>
-        <w:t>.</w:t>
-      </w:r>
-    </w:p>
-    <w:p>
-      <w:r>
-        <w:t xml:space="preserve">Na taj </w:t>
-      </w:r>
-      <w:proofErr w:type="spellStart"/>
-      <w:r>
-        <w:t>način</w:t>
-      </w:r>
-      <w:proofErr w:type="spellEnd"/>
-      <w:r>
-        <w:t xml:space="preserve"> administrator </w:t>
-      </w:r>
-      <w:proofErr w:type="spellStart"/>
-      <w:r>
-        <w:t>može</w:t>
-      </w:r>
-      <w:proofErr w:type="spellEnd"/>
-      <w:r>
-        <w:t xml:space="preserve"> </w:t>
-      </w:r>
-      <w:proofErr w:type="spellStart"/>
-      <w:r>
-        <w:t>lakše</w:t>
-      </w:r>
-      <w:proofErr w:type="spellEnd"/>
-      <w:r>
-        <w:t xml:space="preserve"> da </w:t>
-      </w:r>
-      <w:proofErr w:type="spellStart"/>
-      <w:r>
-        <w:t>dodaje</w:t>
-      </w:r>
-      <w:proofErr w:type="spellEnd"/>
-      <w:r>
-        <w:t xml:space="preserve"> </w:t>
-      </w:r>
-      <w:proofErr w:type="spellStart"/>
-      <w:r>
-        <w:t>nove</w:t>
-      </w:r>
-      <w:proofErr w:type="spellEnd"/>
-      <w:r>
-        <w:t xml:space="preserve"> </w:t>
-      </w:r>
-      <w:proofErr w:type="spellStart"/>
-      <w:r>
-        <w:t>arhetipove</w:t>
-      </w:r>
-      <w:proofErr w:type="spellEnd"/>
-      <w:r>
-        <w:t xml:space="preserve">, </w:t>
-      </w:r>
-      <w:proofErr w:type="spellStart"/>
-      <w:r>
-        <w:t>menja</w:t>
-      </w:r>
-      <w:proofErr w:type="spellEnd"/>
-      <w:r>
-        <w:t xml:space="preserve"> </w:t>
-      </w:r>
-      <w:proofErr w:type="spellStart"/>
-      <w:r>
-        <w:t>uslove</w:t>
-      </w:r>
-      <w:proofErr w:type="spellEnd"/>
-      <w:r>
-        <w:t xml:space="preserve"> za </w:t>
-      </w:r>
-      <w:proofErr w:type="spellStart"/>
-      <w:r>
-        <w:t>postojeće</w:t>
-      </w:r>
-      <w:proofErr w:type="spellEnd"/>
-      <w:r>
-        <w:t xml:space="preserve"> </w:t>
-      </w:r>
-      <w:proofErr w:type="spellStart"/>
-      <w:r>
-        <w:t>špilove</w:t>
-      </w:r>
-      <w:proofErr w:type="spellEnd"/>
-      <w:r>
-        <w:t xml:space="preserve"> </w:t>
-      </w:r>
-      <w:proofErr w:type="spellStart"/>
-      <w:r>
-        <w:t>ili</w:t>
-      </w:r>
-      <w:proofErr w:type="spellEnd"/>
-      <w:r>
-        <w:t xml:space="preserve"> </w:t>
-      </w:r>
-      <w:proofErr w:type="spellStart"/>
-      <w:r>
-        <w:t>podešava</w:t>
-      </w:r>
-      <w:proofErr w:type="spellEnd"/>
-      <w:r>
-        <w:t xml:space="preserve"> </w:t>
-      </w:r>
-      <w:proofErr w:type="spellStart"/>
-      <w:r>
-        <w:t>prioritete</w:t>
-      </w:r>
-      <w:proofErr w:type="spellEnd"/>
-      <w:r>
-        <w:t xml:space="preserve"> bez </w:t>
-      </w:r>
-      <w:proofErr w:type="spellStart"/>
-      <w:r>
-        <w:t>potrebe</w:t>
-      </w:r>
-      <w:proofErr w:type="spellEnd"/>
-      <w:r>
-        <w:t xml:space="preserve"> da se </w:t>
-      </w:r>
-      <w:proofErr w:type="spellStart"/>
-      <w:r>
-        <w:t>menja</w:t>
-      </w:r>
-      <w:proofErr w:type="spellEnd"/>
-      <w:r>
-        <w:t xml:space="preserve"> </w:t>
-      </w:r>
-      <w:proofErr w:type="spellStart"/>
-      <w:r>
-        <w:t>cela</w:t>
-      </w:r>
-      <w:proofErr w:type="spellEnd"/>
-      <w:r>
-        <w:t xml:space="preserve"> </w:t>
-      </w:r>
-      <w:proofErr w:type="spellStart"/>
-      <w:r>
-        <w:t>logika</w:t>
-      </w:r>
-      <w:proofErr w:type="spellEnd"/>
-      <w:r>
-        <w:t xml:space="preserve"> </w:t>
-      </w:r>
-      <w:proofErr w:type="spellStart"/>
-      <w:r>
-        <w:t>sistema</w:t>
-      </w:r>
-      <w:proofErr w:type="spellEnd"/>
-      <w:r>
-        <w:t>. Template-</w:t>
-      </w:r>
-      <w:proofErr w:type="spellStart"/>
-      <w:r>
-        <w:t>i</w:t>
-      </w:r>
-      <w:proofErr w:type="spellEnd"/>
-      <w:r>
-        <w:t xml:space="preserve"> </w:t>
-      </w:r>
-      <w:proofErr w:type="spellStart"/>
-      <w:r>
-        <w:t>će</w:t>
-      </w:r>
-      <w:proofErr w:type="spellEnd"/>
-      <w:r>
-        <w:t xml:space="preserve"> se </w:t>
-      </w:r>
-      <w:proofErr w:type="spellStart"/>
-      <w:r>
-        <w:t>najviše</w:t>
-      </w:r>
-      <w:proofErr w:type="spellEnd"/>
-      <w:r>
-        <w:t xml:space="preserve"> </w:t>
-      </w:r>
-      <w:proofErr w:type="spellStart"/>
-      <w:r>
-        <w:t>koristiti</w:t>
-      </w:r>
-      <w:proofErr w:type="spellEnd"/>
-      <w:r>
-        <w:t xml:space="preserve"> za </w:t>
-      </w:r>
-      <w:proofErr w:type="spellStart"/>
-      <w:r>
-        <w:t>pravila</w:t>
-      </w:r>
-      <w:proofErr w:type="spellEnd"/>
-      <w:r>
-        <w:t xml:space="preserve"> </w:t>
-      </w:r>
-      <w:proofErr w:type="spellStart"/>
-      <w:r>
-        <w:t>validacije</w:t>
-      </w:r>
-      <w:proofErr w:type="spellEnd"/>
-      <w:r>
-        <w:t xml:space="preserve"> </w:t>
-      </w:r>
-      <w:proofErr w:type="spellStart"/>
-      <w:r>
-        <w:t>špila</w:t>
-      </w:r>
-      <w:proofErr w:type="spellEnd"/>
-      <w:r>
-        <w:t xml:space="preserve">, </w:t>
-      </w:r>
-      <w:proofErr w:type="spellStart"/>
-      <w:r>
-        <w:t>izbor</w:t>
-      </w:r>
-      <w:proofErr w:type="spellEnd"/>
-      <w:r>
-        <w:t xml:space="preserve"> </w:t>
-      </w:r>
-      <w:proofErr w:type="spellStart"/>
-      <w:r>
-        <w:t>konkretnih</w:t>
-      </w:r>
-      <w:proofErr w:type="spellEnd"/>
-      <w:r>
-        <w:t xml:space="preserve"> </w:t>
-      </w:r>
-      <w:proofErr w:type="spellStart"/>
-      <w:r>
-        <w:t>karata</w:t>
-      </w:r>
-      <w:proofErr w:type="spellEnd"/>
-      <w:r>
-        <w:t xml:space="preserve"> </w:t>
-      </w:r>
-      <w:proofErr w:type="spellStart"/>
-      <w:r>
-        <w:t>i</w:t>
-      </w:r>
-      <w:proofErr w:type="spellEnd"/>
-      <w:r>
-        <w:t xml:space="preserve"> </w:t>
-      </w:r>
-      <w:proofErr w:type="spellStart"/>
-      <w:r>
-        <w:t>dodelu</w:t>
-      </w:r>
-      <w:proofErr w:type="spellEnd"/>
-      <w:r>
-        <w:t xml:space="preserve"> </w:t>
-      </w:r>
-      <w:proofErr w:type="spellStart"/>
-      <w:r>
-        <w:t>prioriteta</w:t>
-      </w:r>
-      <w:proofErr w:type="spellEnd"/>
-      <w:r>
-        <w:t xml:space="preserve"> </w:t>
-      </w:r>
-      <w:proofErr w:type="spellStart"/>
-      <w:r>
-        <w:t>arhetipovima</w:t>
-      </w:r>
-      <w:proofErr w:type="spellEnd"/>
-      <w:r>
-        <w:t>.</w:t>
+        <w:t xml:space="preserve"> template-a.</w:t>
       </w:r>
     </w:p>
     <w:p>
@@ -12857,11 +11845,7 @@
       </w:r>
       <w:proofErr w:type="spellEnd"/>
       <w:r>
-        <w:t xml:space="preserve">, </w:t>
-      </w:r>
-      <w:r>
-        <w:lastRenderedPageBreak/>
-        <w:t xml:space="preserve">ne </w:t>
+        <w:t xml:space="preserve">, ne </w:t>
       </w:r>
       <w:proofErr w:type="spellStart"/>
       <w:r>
@@ -13472,6 +12456,7 @@
         <w:pStyle w:val="Heading2"/>
       </w:pPr>
       <w:r>
+        <w:lastRenderedPageBreak/>
         <w:t xml:space="preserve">Forward chaining – primer </w:t>
       </w:r>
       <w:proofErr w:type="spellStart"/>
@@ -15410,7 +14395,6 @@
         <w:pStyle w:val="BodyJustify"/>
       </w:pPr>
       <w:r>
-        <w:lastRenderedPageBreak/>
         <w:t xml:space="preserve">CEP </w:t>
       </w:r>
       <w:proofErr w:type="spellStart"/>
@@ -16259,6 +15243,7 @@
         <w:pStyle w:val="BodyJustify"/>
       </w:pPr>
       <w:r>
+        <w:lastRenderedPageBreak/>
         <w:t xml:space="preserve">Na </w:t>
       </w:r>
       <w:proofErr w:type="spellStart"/>
@@ -18165,7 +17150,6 @@
       </w:pPr>
       <w:proofErr w:type="spellStart"/>
       <w:r>
-        <w:lastRenderedPageBreak/>
         <w:t>Sistem</w:t>
       </w:r>
       <w:proofErr w:type="spellEnd"/>

</xml_diff>